<commit_message>
Made changes to protocol 3/17
</commit_message>
<xml_diff>
--- a/protocols/mycorrhiza/Spore Extraction protocol.docx
+++ b/protocols/mycorrhiza/Spore Extraction protocol.docx
@@ -1,20 +1,30 @@
 
 <file path=word/document.xml><?xml version="1.0" encoding="utf-8"?>
-<w:document xmlns:wpc="http://schemas.microsoft.com/office/word/2010/wordprocessingCanvas" xmlns:mc="http://schemas.openxmlformats.org/markup-compatibility/2006" xmlns:o="urn:schemas-microsoft-com:office:office" xmlns:r="http://schemas.openxmlformats.org/officeDocument/2006/relationships" xmlns:m="http://schemas.openxmlformats.org/officeDocument/2006/math" xmlns:v="urn:schemas-microsoft-com:vml" xmlns:wp14="http://schemas.microsoft.com/office/word/2010/wordprocessingDrawing" xmlns:wp="http://schemas.openxmlformats.org/drawingml/2006/wordprocessingDrawing" xmlns:w10="urn:schemas-microsoft-com:office:word" xmlns:w="http://schemas.openxmlformats.org/wordprocessingml/2006/main" xmlns:w14="http://schemas.microsoft.com/office/word/2010/wordml" xmlns:w15="http://schemas.microsoft.com/office/word/2012/wordml" xmlns:wpg="http://schemas.microsoft.com/office/word/2010/wordprocessingGroup" xmlns:wpi="http://schemas.microsoft.com/office/word/2010/wordprocessingInk" xmlns:wne="http://schemas.microsoft.com/office/word/2006/wordml" xmlns:wps="http://schemas.microsoft.com/office/word/2010/wordprocessingShape" xmlns:w16se="http://schemas.microsoft.com/office/word/2015/wordml/symex" xmlns:w16cid="http://schemas.microsoft.com/office/word/2016/wordml/cid" xmlns:w16="http://schemas.microsoft.com/office/word/2018/wordml" xmlns:w16cex="http://schemas.microsoft.com/office/word/2018/wordml/cex" xmlns:w16sdtdh="http://schemas.microsoft.com/office/word/2020/wordml/sdtdatahash" xmlns:w16sdtfl="http://schemas.microsoft.com/office/word/2024/wordml/sdtformatlock" mc:Ignorable="w14 w15 wp14 w16se w16cid w16 w16cex w16sdtdh w16sdtfl">
+<w:document xmlns:wpc="http://schemas.microsoft.com/office/word/2010/wordprocessingCanvas" xmlns:cx="http://schemas.microsoft.com/office/drawing/2014/chartex" xmlns:cx1="http://schemas.microsoft.com/office/drawing/2015/9/8/chartex" xmlns:cx2="http://schemas.microsoft.com/office/drawing/2015/10/21/chartex" xmlns:cx3="http://schemas.microsoft.com/office/drawing/2016/5/9/chartex" xmlns:cx4="http://schemas.microsoft.com/office/drawing/2016/5/10/chartex" xmlns:cx5="http://schemas.microsoft.com/office/drawing/2016/5/11/chartex" xmlns:cx6="http://schemas.microsoft.com/office/drawing/2016/5/12/chartex" xmlns:cx7="http://schemas.microsoft.com/office/drawing/2016/5/13/chartex" xmlns:cx8="http://schemas.microsoft.com/office/drawing/2016/5/14/chartex" xmlns:mc="http://schemas.openxmlformats.org/markup-compatibility/2006" xmlns:aink="http://schemas.microsoft.com/office/drawing/2016/ink" xmlns:am3d="http://schemas.microsoft.com/office/drawing/2017/model3d" xmlns:o="urn:schemas-microsoft-com:office:office" xmlns:oel="http://schemas.microsoft.com/office/2019/extlst" xmlns:r="http://schemas.openxmlformats.org/officeDocument/2006/relationships" xmlns:m="http://schemas.openxmlformats.org/officeDocument/2006/math" xmlns:v="urn:schemas-microsoft-com:vml" xmlns:wp14="http://schemas.microsoft.com/office/word/2010/wordprocessingDrawing" xmlns:wp="http://schemas.openxmlformats.org/drawingml/2006/wordprocessingDrawing" xmlns:w10="urn:schemas-microsoft-com:office:word" xmlns:w="http://schemas.openxmlformats.org/wordprocessingml/2006/main" xmlns:w14="http://schemas.microsoft.com/office/word/2010/wordml" xmlns:w15="http://schemas.microsoft.com/office/word/2012/wordml" xmlns:w16cex="http://schemas.microsoft.com/office/word/2018/wordml/cex" xmlns:w16cid="http://schemas.microsoft.com/office/word/2016/wordml/cid" xmlns:w16="http://schemas.microsoft.com/office/word/2018/wordml" xmlns:w16du="http://schemas.microsoft.com/office/word/2023/wordml/word16du" xmlns:w16sdtdh="http://schemas.microsoft.com/office/word/2020/wordml/sdtdatahash" xmlns:w16sdtfl="http://schemas.microsoft.com/office/word/2024/wordml/sdtformatlock" xmlns:w16se="http://schemas.microsoft.com/office/word/2015/wordml/symex" xmlns:wpg="http://schemas.microsoft.com/office/word/2010/wordprocessingGroup" xmlns:wpi="http://schemas.microsoft.com/office/word/2010/wordprocessingInk" xmlns:wne="http://schemas.microsoft.com/office/word/2006/wordml" xmlns:wps="http://schemas.microsoft.com/office/word/2010/wordprocessingShape" mc:Ignorable="w14 w15 w16se w16cid w16 w16cex w16sdtdh w16sdtfl w16du wp14">
   <w:body>
-    <w:p xmlns:wp14="http://schemas.microsoft.com/office/word/2010/wordml" wp14:paraId="2C078E63" wp14:textId="32B3ABC0">
-      <w:r>
-        <w:rPr/>
+    <w:p>
+      <w:pPr>
+        <w:rPr>
+          <w:b/>
+          <w:bCs/>
+        </w:rPr>
+      </w:pPr>
+      <w:r>
+        <w:rPr>
+          <w:b/>
+          <w:bCs/>
+        </w:rPr>
         <w:t>Spore Extraction Protocol</w:t>
       </w:r>
     </w:p>
     <w:p>
       <w:r>
-        <w:rPr/>
         <w:t>Developed From:</w:t>
       </w:r>
+      <w:r>
+        <w:t xml:space="preserve"> INVAM</w:t>
+      </w:r>
     </w:p>
-    <w:p/>
     <w:p>
       <w:pPr>
         <w:pStyle w:val="ListParagraph"/>
@@ -22,10 +32,8 @@
           <w:ilvl w:val="0"/>
           <w:numId w:val="2"/>
         </w:numPr>
-        <w:rPr/>
-      </w:pPr>
-      <w:r>
-        <w:rPr/>
+      </w:pPr>
+      <w:r>
         <w:t xml:space="preserve">Weigh out 10 grams of soil, to the nearest 0.01 gram (important for balancing centrifuge. </w:t>
       </w:r>
     </w:p>
@@ -36,47 +44,42 @@
           <w:ilvl w:val="0"/>
           <w:numId w:val="2"/>
         </w:numPr>
-        <w:rPr/>
-      </w:pPr>
-      <w:r>
-        <w:rPr/>
-        <w:t xml:space="preserve">Soak </w:t>
-      </w:r>
-      <w:r>
-        <w:rPr/>
-        <w:t>sample</w:t>
-      </w:r>
-      <w:r>
-        <w:rPr/>
-        <w:t xml:space="preserve"> in </w:t>
-      </w:r>
-      <w:r>
-        <w:rPr/>
-        <w:t>25 ml</w:t>
-      </w:r>
-      <w:r>
-        <w:rPr/>
-        <w:t xml:space="preserve"> of </w:t>
-      </w:r>
-      <w:r>
-        <w:rPr/>
-        <w:t>3.9% p/v sodium hexametaphosphate solutio</w:t>
-      </w:r>
-      <w:r>
-        <w:rPr/>
+      </w:pPr>
+      <w:r>
+        <w:t xml:space="preserve">Soak sample in </w:t>
+      </w:r>
+      <w:r>
+        <w:t>5</w:t>
+      </w:r>
+      <w:r>
+        <w:t>0</w:t>
+      </w:r>
+      <w:r>
+        <w:t xml:space="preserve"> ml of </w:t>
+      </w:r>
+      <w:r>
+        <w:t>5</w:t>
+      </w:r>
+      <w:r>
+        <w:t>% p/v sodium hexametaphosphate solutio</w:t>
+      </w:r>
+      <w:r>
         <w:t>n</w:t>
       </w:r>
       <w:r>
-        <w:rPr/>
         <w:t xml:space="preserve">. </w:t>
       </w:r>
       <w:r>
-        <w:rPr/>
         <w:t>Place in r</w:t>
       </w:r>
       <w:r>
-        <w:rPr/>
-        <w:t>eciprocal shaker until microaggregates are no longer present.</w:t>
+        <w:t xml:space="preserve">eciprocal shaker </w:t>
+      </w:r>
+      <w:r>
+        <w:t xml:space="preserve">at 200 rpm </w:t>
+      </w:r>
+      <w:r>
+        <w:t>until microaggregates are no longer present.</w:t>
       </w:r>
     </w:p>
     <w:p>
@@ -86,23 +89,34 @@
           <w:ilvl w:val="0"/>
           <w:numId w:val="2"/>
         </w:numPr>
-        <w:rPr/>
-      </w:pPr>
-      <w:r>
-        <w:rPr/>
-        <w:t xml:space="preserve">Add </w:t>
-      </w:r>
-      <w:r>
-        <w:rPr/>
-        <w:t>100 ml</w:t>
-      </w:r>
-      <w:r>
-        <w:rPr/>
-        <w:t xml:space="preserve"> of water and mix thoroughly, then quickly dump into sieves (500 um placed on 45 um). Rinse </w:t>
-      </w:r>
-      <w:r>
-        <w:rPr/>
-        <w:t xml:space="preserve">both top and bottom sieve thoroughly with RO water. </w:t>
+      </w:pPr>
+      <w:r>
+        <w:t>Add 100 ml of water and mix thoroughly, then quickly dump into sieve</w:t>
+      </w:r>
+      <w:r>
+        <w:t xml:space="preserve"> (45</w:t>
+      </w:r>
+      <w:proofErr w:type="gramStart"/>
+      <w:r>
+        <w:t>um</w:t>
+      </w:r>
+      <w:proofErr w:type="gramEnd"/>
+      <w:r>
+        <w:t xml:space="preserve"> or 38</w:t>
+      </w:r>
+      <w:proofErr w:type="gramStart"/>
+      <w:r>
+        <w:t>um</w:t>
+      </w:r>
+      <w:proofErr w:type="gramEnd"/>
+      <w:r>
+        <w:t>)</w:t>
+      </w:r>
+      <w:r>
+        <w:t>. Rinse</w:t>
+      </w:r>
+      <w:r>
+        <w:t xml:space="preserve"> thoroughly with RO water. </w:t>
       </w:r>
     </w:p>
     <w:p>
@@ -112,51 +126,18 @@
           <w:ilvl w:val="0"/>
           <w:numId w:val="2"/>
         </w:numPr>
-        <w:rPr/>
-      </w:pPr>
-      <w:r>
-        <w:rPr/>
-        <w:t xml:space="preserve">Transfer contents of the bottom sieve into a </w:t>
-      </w:r>
-      <w:r>
-        <w:rPr/>
-        <w:t>50 ml</w:t>
-      </w:r>
-      <w:r>
-        <w:rPr/>
-        <w:t xml:space="preserve"> centrifuge tube</w:t>
-      </w:r>
-      <w:r>
-        <w:rPr/>
-        <w:t xml:space="preserve"> with </w:t>
-      </w:r>
-      <w:r>
-        <w:rPr/>
-        <w:t>10 ml</w:t>
-      </w:r>
-      <w:r>
-        <w:rPr/>
-        <w:t xml:space="preserve"> of water and </w:t>
-      </w:r>
-      <w:r>
-        <w:rPr/>
-        <w:t>20 ml</w:t>
-      </w:r>
-      <w:r>
-        <w:rPr/>
-        <w:t xml:space="preserve"> of 60% p/v sucrose solution,</w:t>
-      </w:r>
-      <w:r>
-        <w:rPr/>
-        <w:t xml:space="preserve"> then centrifuge at 2000 rpm (</w:t>
-      </w:r>
-      <w:r>
-        <w:rPr/>
-        <w:t>1900 g</w:t>
-      </w:r>
-      <w:r>
-        <w:rPr/>
-        <w:t xml:space="preserve"> or 960 g?)</w:t>
+      </w:pPr>
+      <w:r>
+        <w:t>Transfer contents of the bottom sieve into a 50 ml centrifuge tube</w:t>
+      </w:r>
+      <w:r>
+        <w:t xml:space="preserve">, use water to wash into </w:t>
+      </w:r>
+      <w:r>
+        <w:t>tube</w:t>
+      </w:r>
+      <w:r>
+        <w:t>.</w:t>
       </w:r>
     </w:p>
     <w:p>
@@ -166,35 +147,9 @@
           <w:ilvl w:val="0"/>
           <w:numId w:val="2"/>
         </w:numPr>
-        <w:rPr/>
-      </w:pPr>
-      <w:r>
-        <w:rPr/>
-        <w:t xml:space="preserve">Quickly dump supernatant into </w:t>
-      </w:r>
-      <w:r>
-        <w:rPr/>
-        <w:t>the smallest</w:t>
-      </w:r>
-      <w:r>
-        <w:rPr/>
-        <w:t xml:space="preserve"> sieve and wash with water, then transfer into a petri dish.</w:t>
-      </w:r>
-    </w:p>
-    <w:p>
-      <w:pPr>
-        <w:pStyle w:val="Normal"/>
-        <w:rPr>
-          <w:sz w:val="24"/>
-          <w:szCs w:val="24"/>
-        </w:rPr>
-      </w:pPr>
-      <w:r>
-        <w:rPr>
-          <w:sz w:val="24"/>
-          <w:szCs w:val="24"/>
-        </w:rPr>
-        <w:t>Counting</w:t>
+      </w:pPr>
+      <w:r>
+        <w:t xml:space="preserve">Let the tube sit overnight. Decant the water in the morning. </w:t>
       </w:r>
     </w:p>
     <w:p>
@@ -202,40 +157,26 @@
         <w:pStyle w:val="ListParagraph"/>
         <w:numPr>
           <w:ilvl w:val="0"/>
-          <w:numId w:val="3"/>
+          <w:numId w:val="2"/>
         </w:numPr>
-        <w:rPr>
-          <w:sz w:val="24"/>
-          <w:szCs w:val="24"/>
-        </w:rPr>
-      </w:pPr>
-      <w:r>
-        <w:rPr>
-          <w:sz w:val="24"/>
-          <w:szCs w:val="24"/>
-        </w:rPr>
-        <w:t xml:space="preserve">Place </w:t>
-      </w:r>
-      <w:r>
-        <w:rPr>
-          <w:sz w:val="24"/>
-          <w:szCs w:val="24"/>
-        </w:rPr>
-        <w:t>1 ml</w:t>
-      </w:r>
-      <w:r>
-        <w:rPr>
-          <w:sz w:val="24"/>
-          <w:szCs w:val="24"/>
-        </w:rPr>
-        <w:t xml:space="preserve"> of </w:t>
-      </w:r>
-      <w:r>
-        <w:rPr>
-          <w:sz w:val="24"/>
-          <w:szCs w:val="24"/>
-        </w:rPr>
-        <w:t>extracted spores into a petri dish with enough water to cover the bottom of the petri dish.</w:t>
+      </w:pPr>
+      <w:r>
+        <w:t xml:space="preserve">Fill tube </w:t>
+      </w:r>
+      <w:r>
+        <w:t>with 10 ml of water and</w:t>
+      </w:r>
+      <w:r>
+        <w:t xml:space="preserve"> top with </w:t>
+      </w:r>
+      <w:r>
+        <w:t>60% p/v sucrose solution,</w:t>
+      </w:r>
+      <w:r>
+        <w:t xml:space="preserve"> then centrifuge at </w:t>
+      </w:r>
+      <w:r>
+        <w:t>960 g for 5 minutes.</w:t>
       </w:r>
     </w:p>
     <w:p>
@@ -243,19 +184,36 @@
         <w:pStyle w:val="ListParagraph"/>
         <w:numPr>
           <w:ilvl w:val="0"/>
-          <w:numId w:val="3"/>
+          <w:numId w:val="2"/>
         </w:numPr>
-        <w:rPr>
-          <w:sz w:val="24"/>
-          <w:szCs w:val="24"/>
-        </w:rPr>
-      </w:pPr>
-      <w:r>
-        <w:rPr>
-          <w:sz w:val="24"/>
-          <w:szCs w:val="24"/>
-        </w:rPr>
-        <w:t xml:space="preserve">Rotate the dish to spread out the spores randomly. </w:t>
+      </w:pPr>
+      <w:r>
+        <w:t xml:space="preserve">Quickly dump supernatant into </w:t>
+      </w:r>
+      <w:r>
+        <w:t>the smallest</w:t>
+      </w:r>
+      <w:r>
+        <w:t xml:space="preserve"> </w:t>
+      </w:r>
+      <w:r>
+        <w:t>(38</w:t>
+      </w:r>
+      <w:proofErr w:type="gramStart"/>
+      <w:r>
+        <w:t>um</w:t>
+      </w:r>
+      <w:proofErr w:type="gramEnd"/>
+      <w:r>
+        <w:t xml:space="preserve">) </w:t>
+      </w:r>
+      <w:r>
+        <w:t>sieve and wash with water, then transfer into a petri dish.</w:t>
+      </w:r>
+    </w:p>
+    <w:p>
+      <w:r>
+        <w:t>Counting</w:t>
       </w:r>
     </w:p>
     <w:p>
@@ -263,40 +221,17 @@
         <w:pStyle w:val="ListParagraph"/>
         <w:numPr>
           <w:ilvl w:val="0"/>
-          <w:numId w:val="3"/>
+          <w:numId w:val="1"/>
         </w:numPr>
-        <w:rPr>
-          <w:sz w:val="24"/>
-          <w:szCs w:val="24"/>
-        </w:rPr>
-      </w:pPr>
-      <w:r>
-        <w:rPr>
-          <w:sz w:val="24"/>
-          <w:szCs w:val="24"/>
-        </w:rPr>
-        <w:t xml:space="preserve">Place a 1 cm by </w:t>
-      </w:r>
-      <w:r>
-        <w:rPr>
-          <w:sz w:val="24"/>
-          <w:szCs w:val="24"/>
-        </w:rPr>
-        <w:t>1 cm</w:t>
-      </w:r>
-      <w:r>
-        <w:rPr>
-          <w:sz w:val="24"/>
-          <w:szCs w:val="24"/>
-        </w:rPr>
-        <w:t xml:space="preserve"> grid under the petri dish, and count the number of spores in 10 of the squares</w:t>
-      </w:r>
-      <w:r>
-        <w:rPr>
-          <w:sz w:val="24"/>
-          <w:szCs w:val="24"/>
-        </w:rPr>
-        <w:t>.</w:t>
+      </w:pPr>
+      <w:r>
+        <w:t>Wash</w:t>
+      </w:r>
+      <w:r>
+        <w:t xml:space="preserve"> </w:t>
+      </w:r>
+      <w:r>
+        <w:t>extracted spores into a petri dish with enough water to cover the bottom of the petri dish.</w:t>
       </w:r>
     </w:p>
     <w:p>
@@ -304,46 +239,67 @@
         <w:pStyle w:val="ListParagraph"/>
         <w:numPr>
           <w:ilvl w:val="0"/>
-          <w:numId w:val="3"/>
+          <w:numId w:val="1"/>
         </w:numPr>
-        <w:rPr>
-          <w:sz w:val="24"/>
-          <w:szCs w:val="24"/>
-        </w:rPr>
-      </w:pPr>
-      <w:r>
-        <w:rPr>
-          <w:sz w:val="24"/>
-          <w:szCs w:val="24"/>
-        </w:rPr>
-        <w:t xml:space="preserve">Multiple by the total number of squares per grid to estimate </w:t>
-      </w:r>
-      <w:r>
-        <w:rPr>
-          <w:sz w:val="24"/>
-          <w:szCs w:val="24"/>
-        </w:rPr>
-        <w:t xml:space="preserve">the number of spores </w:t>
-      </w:r>
-      <w:r>
-        <w:rPr>
-          <w:sz w:val="24"/>
-          <w:szCs w:val="24"/>
-        </w:rPr>
-        <w:t xml:space="preserve">per ml of inoculum </w:t>
+      </w:pPr>
+      <w:r>
+        <w:t>Rotate the dish</w:t>
+      </w:r>
+      <w:r>
+        <w:t xml:space="preserve"> back and forth</w:t>
+      </w:r>
+      <w:r>
+        <w:t xml:space="preserve"> to spread out the spores randomly. </w:t>
       </w:r>
     </w:p>
     <w:p>
       <w:pPr>
-        <w:pStyle w:val="Normal"/>
-        <w:rPr>
-          <w:sz w:val="24"/>
-          <w:szCs w:val="24"/>
-        </w:rPr>
-      </w:pPr>
+        <w:pStyle w:val="ListParagraph"/>
+        <w:numPr>
+          <w:ilvl w:val="0"/>
+          <w:numId w:val="1"/>
+        </w:numPr>
+      </w:pPr>
+      <w:r>
+        <w:t xml:space="preserve">Place a 1 cm by 1 cm grid under the petri </w:t>
+      </w:r>
+      <w:r>
+        <w:t>dish and</w:t>
+      </w:r>
+      <w:r>
+        <w:t xml:space="preserve"> count the number of spores in </w:t>
+      </w:r>
+      <w:r>
+        <w:t>10</w:t>
+      </w:r>
+      <w:r>
+        <w:t xml:space="preserve"> squares</w:t>
+      </w:r>
+      <w:r>
+        <w:t>.</w:t>
+      </w:r>
     </w:p>
+    <w:p>
+      <w:pPr>
+        <w:pStyle w:val="ListParagraph"/>
+        <w:numPr>
+          <w:ilvl w:val="0"/>
+          <w:numId w:val="1"/>
+        </w:numPr>
+      </w:pPr>
+      <w:r>
+        <w:t xml:space="preserve">Multiple by the total number of squares per grid to estimate </w:t>
+      </w:r>
+      <w:r>
+        <w:t xml:space="preserve">the number of spores </w:t>
+      </w:r>
+      <w:r>
+        <w:t xml:space="preserve">per ml of inoculum </w:t>
+      </w:r>
+    </w:p>
+    <w:p/>
     <w:sectPr>
-      <w:pgSz w:w="12240" w:h="15840" w:orient="portrait"/>
+      <w:pgSz w:w="12240" w:h="15840"/>
       <w:pgMar w:top="1440" w:right="1440" w:bottom="1440" w:left="1440" w:header="720" w:footer="720" w:gutter="0"/>
       <w:cols w:space="720"/>
       <w:docGrid w:linePitch="360"/>
@@ -353,11 +309,12 @@
 </file>
 
 <file path=word/numbering.xml><?xml version="1.0" encoding="utf-8"?>
-<w:numbering xmlns:w="http://schemas.openxmlformats.org/wordprocessingml/2006/main">
-  <w:abstractNum xmlns:w="http://schemas.openxmlformats.org/wordprocessingml/2006/main" w:abstractNumId="3">
-    <w:nsid w:val="6637d9ed"/>
-    <w:multiLevelType xmlns:w="http://schemas.openxmlformats.org/wordprocessingml/2006/main" w:val="hybridMultilevel"/>
-    <w:lvl xmlns:w="http://schemas.openxmlformats.org/wordprocessingml/2006/main" w:ilvl="0">
+<w:numbering xmlns:wpc="http://schemas.microsoft.com/office/word/2010/wordprocessingCanvas" xmlns:cx="http://schemas.microsoft.com/office/drawing/2014/chartex" xmlns:cx1="http://schemas.microsoft.com/office/drawing/2015/9/8/chartex" xmlns:cx2="http://schemas.microsoft.com/office/drawing/2015/10/21/chartex" xmlns:cx3="http://schemas.microsoft.com/office/drawing/2016/5/9/chartex" xmlns:cx4="http://schemas.microsoft.com/office/drawing/2016/5/10/chartex" xmlns:cx5="http://schemas.microsoft.com/office/drawing/2016/5/11/chartex" xmlns:cx6="http://schemas.microsoft.com/office/drawing/2016/5/12/chartex" xmlns:cx7="http://schemas.microsoft.com/office/drawing/2016/5/13/chartex" xmlns:cx8="http://schemas.microsoft.com/office/drawing/2016/5/14/chartex" xmlns:mc="http://schemas.openxmlformats.org/markup-compatibility/2006" xmlns:aink="http://schemas.microsoft.com/office/drawing/2016/ink" xmlns:am3d="http://schemas.microsoft.com/office/drawing/2017/model3d" xmlns:o="urn:schemas-microsoft-com:office:office" xmlns:oel="http://schemas.microsoft.com/office/2019/extlst" xmlns:r="http://schemas.openxmlformats.org/officeDocument/2006/relationships" xmlns:m="http://schemas.openxmlformats.org/officeDocument/2006/math" xmlns:v="urn:schemas-microsoft-com:vml" xmlns:wp14="http://schemas.microsoft.com/office/word/2010/wordprocessingDrawing" xmlns:wp="http://schemas.openxmlformats.org/drawingml/2006/wordprocessingDrawing" xmlns:w10="urn:schemas-microsoft-com:office:word" xmlns:w="http://schemas.openxmlformats.org/wordprocessingml/2006/main" xmlns:w14="http://schemas.microsoft.com/office/word/2010/wordml" xmlns:w15="http://schemas.microsoft.com/office/word/2012/wordml" xmlns:w16cex="http://schemas.microsoft.com/office/word/2018/wordml/cex" xmlns:w16cid="http://schemas.microsoft.com/office/word/2016/wordml/cid" xmlns:w16="http://schemas.microsoft.com/office/word/2018/wordml" xmlns:w16du="http://schemas.microsoft.com/office/word/2023/wordml/word16du" xmlns:w16sdtdh="http://schemas.microsoft.com/office/word/2020/wordml/sdtdatahash" xmlns:w16sdtfl="http://schemas.microsoft.com/office/word/2024/wordml/sdtformatlock" xmlns:w16se="http://schemas.microsoft.com/office/word/2015/wordml/symex" xmlns:wpg="http://schemas.microsoft.com/office/word/2010/wordprocessingGroup" xmlns:wpi="http://schemas.microsoft.com/office/word/2010/wordprocessingInk" xmlns:wne="http://schemas.microsoft.com/office/word/2006/wordml" xmlns:wps="http://schemas.microsoft.com/office/word/2010/wordprocessingShape" mc:Ignorable="w14 w15 w16se w16cid w16 w16cex w16sdtdh w16sdtfl w16du wp14">
+  <w:abstractNum w:abstractNumId="0" w15:restartNumberingAfterBreak="0">
+    <w:nsid w:val="10D2C0A0"/>
+    <w:multiLevelType w:val="hybridMultilevel"/>
+    <w:tmpl w:val="91E21B52"/>
+    <w:lvl w:ilvl="0" w:tplc="57E8BFE2">
       <w:start w:val="1"/>
       <w:numFmt w:val="decimal"/>
       <w:lvlText w:val="%1."/>
@@ -366,7 +323,7 @@
         <w:ind w:left="720" w:hanging="360"/>
       </w:pPr>
     </w:lvl>
-    <w:lvl xmlns:w="http://schemas.openxmlformats.org/wordprocessingml/2006/main" w:ilvl="1">
+    <w:lvl w:ilvl="1" w:tplc="C29EE3E2">
       <w:start w:val="1"/>
       <w:numFmt w:val="lowerLetter"/>
       <w:lvlText w:val="%2."/>
@@ -375,7 +332,7 @@
         <w:ind w:left="1440" w:hanging="360"/>
       </w:pPr>
     </w:lvl>
-    <w:lvl xmlns:w="http://schemas.openxmlformats.org/wordprocessingml/2006/main" w:ilvl="2">
+    <w:lvl w:ilvl="2" w:tplc="F90E27A0">
       <w:start w:val="1"/>
       <w:numFmt w:val="lowerRoman"/>
       <w:lvlText w:val="%3."/>
@@ -384,7 +341,7 @@
         <w:ind w:left="2160" w:hanging="180"/>
       </w:pPr>
     </w:lvl>
-    <w:lvl xmlns:w="http://schemas.openxmlformats.org/wordprocessingml/2006/main" w:ilvl="3">
+    <w:lvl w:ilvl="3" w:tplc="972ABFCE">
       <w:start w:val="1"/>
       <w:numFmt w:val="decimal"/>
       <w:lvlText w:val="%4."/>
@@ -393,7 +350,7 @@
         <w:ind w:left="2880" w:hanging="360"/>
       </w:pPr>
     </w:lvl>
-    <w:lvl xmlns:w="http://schemas.openxmlformats.org/wordprocessingml/2006/main" w:ilvl="4">
+    <w:lvl w:ilvl="4" w:tplc="EE0CE2D2">
       <w:start w:val="1"/>
       <w:numFmt w:val="lowerLetter"/>
       <w:lvlText w:val="%5."/>
@@ -402,7 +359,7 @@
         <w:ind w:left="3600" w:hanging="360"/>
       </w:pPr>
     </w:lvl>
-    <w:lvl xmlns:w="http://schemas.openxmlformats.org/wordprocessingml/2006/main" w:ilvl="5">
+    <w:lvl w:ilvl="5" w:tplc="31B8DC60">
       <w:start w:val="1"/>
       <w:numFmt w:val="lowerRoman"/>
       <w:lvlText w:val="%6."/>
@@ -411,7 +368,7 @@
         <w:ind w:left="4320" w:hanging="180"/>
       </w:pPr>
     </w:lvl>
-    <w:lvl xmlns:w="http://schemas.openxmlformats.org/wordprocessingml/2006/main" w:ilvl="6">
+    <w:lvl w:ilvl="6" w:tplc="0450EC3E">
       <w:start w:val="1"/>
       <w:numFmt w:val="decimal"/>
       <w:lvlText w:val="%7."/>
@@ -420,7 +377,7 @@
         <w:ind w:left="5040" w:hanging="360"/>
       </w:pPr>
     </w:lvl>
-    <w:lvl xmlns:w="http://schemas.openxmlformats.org/wordprocessingml/2006/main" w:ilvl="7">
+    <w:lvl w:ilvl="7" w:tplc="BE066B44">
       <w:start w:val="1"/>
       <w:numFmt w:val="lowerLetter"/>
       <w:lvlText w:val="%8."/>
@@ -429,7 +386,7 @@
         <w:ind w:left="5760" w:hanging="360"/>
       </w:pPr>
     </w:lvl>
-    <w:lvl xmlns:w="http://schemas.openxmlformats.org/wordprocessingml/2006/main" w:ilvl="8">
+    <w:lvl w:ilvl="8" w:tplc="6E22A112">
       <w:start w:val="1"/>
       <w:numFmt w:val="lowerRoman"/>
       <w:lvlText w:val="%9."/>
@@ -439,10 +396,11 @@
       </w:pPr>
     </w:lvl>
   </w:abstractNum>
-  <w:abstractNum xmlns:w="http://schemas.openxmlformats.org/wordprocessingml/2006/main" w:abstractNumId="2">
-    <w:nsid w:val="72157f3f"/>
-    <w:multiLevelType xmlns:w="http://schemas.openxmlformats.org/wordprocessingml/2006/main" w:val="hybridMultilevel"/>
-    <w:lvl xmlns:w="http://schemas.openxmlformats.org/wordprocessingml/2006/main" w:ilvl="0">
+  <w:abstractNum w:abstractNumId="1" w15:restartNumberingAfterBreak="0">
+    <w:nsid w:val="6637D9ED"/>
+    <w:multiLevelType w:val="hybridMultilevel"/>
+    <w:tmpl w:val="E5BE4AA6"/>
+    <w:lvl w:ilvl="0" w:tplc="26AA912A">
       <w:start w:val="1"/>
       <w:numFmt w:val="decimal"/>
       <w:lvlText w:val="%1."/>
@@ -451,7 +409,7 @@
         <w:ind w:left="720" w:hanging="360"/>
       </w:pPr>
     </w:lvl>
-    <w:lvl xmlns:w="http://schemas.openxmlformats.org/wordprocessingml/2006/main" w:ilvl="1">
+    <w:lvl w:ilvl="1" w:tplc="7FB25076">
       <w:start w:val="1"/>
       <w:numFmt w:val="lowerLetter"/>
       <w:lvlText w:val="%2."/>
@@ -460,7 +418,7 @@
         <w:ind w:left="1440" w:hanging="360"/>
       </w:pPr>
     </w:lvl>
-    <w:lvl xmlns:w="http://schemas.openxmlformats.org/wordprocessingml/2006/main" w:ilvl="2">
+    <w:lvl w:ilvl="2" w:tplc="35D0DF1A">
       <w:start w:val="1"/>
       <w:numFmt w:val="lowerRoman"/>
       <w:lvlText w:val="%3."/>
@@ -469,7 +427,7 @@
         <w:ind w:left="2160" w:hanging="180"/>
       </w:pPr>
     </w:lvl>
-    <w:lvl xmlns:w="http://schemas.openxmlformats.org/wordprocessingml/2006/main" w:ilvl="3">
+    <w:lvl w:ilvl="3" w:tplc="91029866">
       <w:start w:val="1"/>
       <w:numFmt w:val="decimal"/>
       <w:lvlText w:val="%4."/>
@@ -478,7 +436,7 @@
         <w:ind w:left="2880" w:hanging="360"/>
       </w:pPr>
     </w:lvl>
-    <w:lvl xmlns:w="http://schemas.openxmlformats.org/wordprocessingml/2006/main" w:ilvl="4">
+    <w:lvl w:ilvl="4" w:tplc="26A62A06">
       <w:start w:val="1"/>
       <w:numFmt w:val="lowerLetter"/>
       <w:lvlText w:val="%5."/>
@@ -487,7 +445,7 @@
         <w:ind w:left="3600" w:hanging="360"/>
       </w:pPr>
     </w:lvl>
-    <w:lvl xmlns:w="http://schemas.openxmlformats.org/wordprocessingml/2006/main" w:ilvl="5">
+    <w:lvl w:ilvl="5" w:tplc="70E45222">
       <w:start w:val="1"/>
       <w:numFmt w:val="lowerRoman"/>
       <w:lvlText w:val="%6."/>
@@ -496,7 +454,7 @@
         <w:ind w:left="4320" w:hanging="180"/>
       </w:pPr>
     </w:lvl>
-    <w:lvl xmlns:w="http://schemas.openxmlformats.org/wordprocessingml/2006/main" w:ilvl="6">
+    <w:lvl w:ilvl="6" w:tplc="3AFE7948">
       <w:start w:val="1"/>
       <w:numFmt w:val="decimal"/>
       <w:lvlText w:val="%7."/>
@@ -505,7 +463,7 @@
         <w:ind w:left="5040" w:hanging="360"/>
       </w:pPr>
     </w:lvl>
-    <w:lvl xmlns:w="http://schemas.openxmlformats.org/wordprocessingml/2006/main" w:ilvl="7">
+    <w:lvl w:ilvl="7" w:tplc="2500B258">
       <w:start w:val="1"/>
       <w:numFmt w:val="lowerLetter"/>
       <w:lvlText w:val="%8."/>
@@ -514,7 +472,7 @@
         <w:ind w:left="5760" w:hanging="360"/>
       </w:pPr>
     </w:lvl>
-    <w:lvl xmlns:w="http://schemas.openxmlformats.org/wordprocessingml/2006/main" w:ilvl="8">
+    <w:lvl w:ilvl="8" w:tplc="573AACBC">
       <w:start w:val="1"/>
       <w:numFmt w:val="lowerRoman"/>
       <w:lvlText w:val="%9."/>
@@ -524,10 +482,11 @@
       </w:pPr>
     </w:lvl>
   </w:abstractNum>
-  <w:abstractNum xmlns:w="http://schemas.openxmlformats.org/wordprocessingml/2006/main" w:abstractNumId="1">
-    <w:nsid w:val="10d2c0a0"/>
-    <w:multiLevelType xmlns:w="http://schemas.openxmlformats.org/wordprocessingml/2006/main" w:val="hybridMultilevel"/>
-    <w:lvl xmlns:w="http://schemas.openxmlformats.org/wordprocessingml/2006/main" w:ilvl="0">
+  <w:abstractNum w:abstractNumId="2" w15:restartNumberingAfterBreak="0">
+    <w:nsid w:val="72157F3F"/>
+    <w:multiLevelType w:val="hybridMultilevel"/>
+    <w:tmpl w:val="AF1C4CC4"/>
+    <w:lvl w:ilvl="0" w:tplc="830C0628">
       <w:start w:val="1"/>
       <w:numFmt w:val="decimal"/>
       <w:lvlText w:val="%1."/>
@@ -536,7 +495,7 @@
         <w:ind w:left="720" w:hanging="360"/>
       </w:pPr>
     </w:lvl>
-    <w:lvl xmlns:w="http://schemas.openxmlformats.org/wordprocessingml/2006/main" w:ilvl="1">
+    <w:lvl w:ilvl="1" w:tplc="7242BCBA">
       <w:start w:val="1"/>
       <w:numFmt w:val="lowerLetter"/>
       <w:lvlText w:val="%2."/>
@@ -545,7 +504,7 @@
         <w:ind w:left="1440" w:hanging="360"/>
       </w:pPr>
     </w:lvl>
-    <w:lvl xmlns:w="http://schemas.openxmlformats.org/wordprocessingml/2006/main" w:ilvl="2">
+    <w:lvl w:ilvl="2" w:tplc="BF7A4CDC">
       <w:start w:val="1"/>
       <w:numFmt w:val="lowerRoman"/>
       <w:lvlText w:val="%3."/>
@@ -554,7 +513,7 @@
         <w:ind w:left="2160" w:hanging="180"/>
       </w:pPr>
     </w:lvl>
-    <w:lvl xmlns:w="http://schemas.openxmlformats.org/wordprocessingml/2006/main" w:ilvl="3">
+    <w:lvl w:ilvl="3" w:tplc="EA405F36">
       <w:start w:val="1"/>
       <w:numFmt w:val="decimal"/>
       <w:lvlText w:val="%4."/>
@@ -563,7 +522,7 @@
         <w:ind w:left="2880" w:hanging="360"/>
       </w:pPr>
     </w:lvl>
-    <w:lvl xmlns:w="http://schemas.openxmlformats.org/wordprocessingml/2006/main" w:ilvl="4">
+    <w:lvl w:ilvl="4" w:tplc="02469F14">
       <w:start w:val="1"/>
       <w:numFmt w:val="lowerLetter"/>
       <w:lvlText w:val="%5."/>
@@ -572,7 +531,7 @@
         <w:ind w:left="3600" w:hanging="360"/>
       </w:pPr>
     </w:lvl>
-    <w:lvl xmlns:w="http://schemas.openxmlformats.org/wordprocessingml/2006/main" w:ilvl="5">
+    <w:lvl w:ilvl="5" w:tplc="45D8DDC6">
       <w:start w:val="1"/>
       <w:numFmt w:val="lowerRoman"/>
       <w:lvlText w:val="%6."/>
@@ -581,7 +540,7 @@
         <w:ind w:left="4320" w:hanging="180"/>
       </w:pPr>
     </w:lvl>
-    <w:lvl xmlns:w="http://schemas.openxmlformats.org/wordprocessingml/2006/main" w:ilvl="6">
+    <w:lvl w:ilvl="6" w:tplc="73BC6FBE">
       <w:start w:val="1"/>
       <w:numFmt w:val="decimal"/>
       <w:lvlText w:val="%7."/>
@@ -590,7 +549,7 @@
         <w:ind w:left="5040" w:hanging="360"/>
       </w:pPr>
     </w:lvl>
-    <w:lvl xmlns:w="http://schemas.openxmlformats.org/wordprocessingml/2006/main" w:ilvl="7">
+    <w:lvl w:ilvl="7" w:tplc="65503264">
       <w:start w:val="1"/>
       <w:numFmt w:val="lowerLetter"/>
       <w:lvlText w:val="%8."/>
@@ -599,7 +558,7 @@
         <w:ind w:left="5760" w:hanging="360"/>
       </w:pPr>
     </w:lvl>
-    <w:lvl xmlns:w="http://schemas.openxmlformats.org/wordprocessingml/2006/main" w:ilvl="8">
+    <w:lvl w:ilvl="8" w:tplc="9550AF9C">
       <w:start w:val="1"/>
       <w:numFmt w:val="lowerRoman"/>
       <w:lvlText w:val="%9."/>
@@ -609,24 +568,24 @@
       </w:pPr>
     </w:lvl>
   </w:abstractNum>
-  <w:num w:numId="3">
-    <w:abstractNumId w:val="3"/>
+  <w:num w:numId="1" w16cid:durableId="1232155635">
+    <w:abstractNumId w:val="1"/>
   </w:num>
-  <w:num w:numId="2">
+  <w:num w:numId="2" w16cid:durableId="1250844149">
     <w:abstractNumId w:val="2"/>
   </w:num>
-  <w:num w:numId="1">
-    <w:abstractNumId w:val="1"/>
+  <w:num w:numId="3" w16cid:durableId="178930790">
+    <w:abstractNumId w:val="0"/>
   </w:num>
 </w:numbering>
 </file>
 
 <file path=word/styles.xml><?xml version="1.0" encoding="utf-8"?>
-<w:styles xmlns:wp14="http://schemas.microsoft.com/office/word/2010/wordprocessingDrawing" xmlns:mc="http://schemas.openxmlformats.org/markup-compatibility/2006" xmlns:r="http://schemas.openxmlformats.org/officeDocument/2006/relationships" xmlns:w="http://schemas.openxmlformats.org/wordprocessingml/2006/main" xmlns:w14="http://schemas.microsoft.com/office/word/2010/wordml" xmlns:w15="http://schemas.microsoft.com/office/word/2012/wordml" xmlns:w16se="http://schemas.microsoft.com/office/word/2015/wordml/symex" xmlns:w16cid="http://schemas.microsoft.com/office/word/2016/wordml/cid" xmlns:w16="http://schemas.microsoft.com/office/word/2018/wordml" xmlns:w16cex="http://schemas.microsoft.com/office/word/2018/wordml/cex" xmlns:w16sdtdh="http://schemas.microsoft.com/office/word/2020/wordml/sdtdatahash" xmlns:w16sdtfl="http://schemas.microsoft.com/office/word/2024/wordml/sdtformatlock" mc:Ignorable="w14 w15 wp14 w16se w16cid w16 w16cex w16sdtdh w16sdtfl">
+<w:styles xmlns:mc="http://schemas.openxmlformats.org/markup-compatibility/2006" xmlns:r="http://schemas.openxmlformats.org/officeDocument/2006/relationships" xmlns:w="http://schemas.openxmlformats.org/wordprocessingml/2006/main" xmlns:w14="http://schemas.microsoft.com/office/word/2010/wordml" xmlns:w15="http://schemas.microsoft.com/office/word/2012/wordml" xmlns:w16cex="http://schemas.microsoft.com/office/word/2018/wordml/cex" xmlns:w16cid="http://schemas.microsoft.com/office/word/2016/wordml/cid" xmlns:w16="http://schemas.microsoft.com/office/word/2018/wordml" xmlns:w16du="http://schemas.microsoft.com/office/word/2023/wordml/word16du" xmlns:w16sdtdh="http://schemas.microsoft.com/office/word/2020/wordml/sdtdatahash" xmlns:w16sdtfl="http://schemas.microsoft.com/office/word/2024/wordml/sdtformatlock" xmlns:w16se="http://schemas.microsoft.com/office/word/2015/wordml/symex" mc:Ignorable="w14 w15 w16se w16cid w16 w16cex w16sdtdh w16sdtfl w16du">
   <w:docDefaults>
     <w:rPrDefault>
       <w:rPr>
-        <w:rFonts w:asciiTheme="minorHAnsi" w:hAnsiTheme="minorHAnsi" w:eastAsiaTheme="minorEastAsia" w:cstheme="minorBidi"/>
+        <w:rFonts w:asciiTheme="minorHAnsi" w:eastAsiaTheme="minorEastAsia" w:hAnsiTheme="minorHAnsi" w:cstheme="minorBidi"/>
         <w:sz w:val="24"/>
         <w:szCs w:val="24"/>
         <w:lang w:val="en-US" w:eastAsia="ja-JP" w:bidi="ar-SA"/>
@@ -638,17 +597,17 @@
       </w:pPr>
     </w:pPrDefault>
   </w:docDefaults>
-  <w:latentStyles w:defLockedState="0" w:defUIPriority="99" w:defSemiHidden="0" w:defUnhideWhenUsed="0" w:defQFormat="0" w:count="371">
+  <w:latentStyles w:defLockedState="0" w:defUIPriority="99" w:defSemiHidden="0" w:defUnhideWhenUsed="0" w:defQFormat="0" w:count="376">
     <w:lsdException w:name="Normal" w:uiPriority="0" w:qFormat="1"/>
     <w:lsdException w:name="heading 1" w:uiPriority="9" w:qFormat="1"/>
-    <w:lsdException w:name="heading 2" w:uiPriority="9" w:semiHidden="1" w:unhideWhenUsed="1" w:qFormat="1"/>
-    <w:lsdException w:name="heading 3" w:uiPriority="9" w:semiHidden="1" w:unhideWhenUsed="1" w:qFormat="1"/>
-    <w:lsdException w:name="heading 4" w:uiPriority="9" w:semiHidden="1" w:unhideWhenUsed="1" w:qFormat="1"/>
-    <w:lsdException w:name="heading 5" w:uiPriority="9" w:semiHidden="1" w:unhideWhenUsed="1" w:qFormat="1"/>
-    <w:lsdException w:name="heading 6" w:uiPriority="9" w:semiHidden="1" w:unhideWhenUsed="1" w:qFormat="1"/>
-    <w:lsdException w:name="heading 7" w:uiPriority="9" w:semiHidden="1" w:unhideWhenUsed="1" w:qFormat="1"/>
-    <w:lsdException w:name="heading 8" w:uiPriority="9" w:semiHidden="1" w:unhideWhenUsed="1" w:qFormat="1"/>
-    <w:lsdException w:name="heading 9" w:uiPriority="9" w:semiHidden="1" w:unhideWhenUsed="1" w:qFormat="1"/>
+    <w:lsdException w:name="heading 2" w:semiHidden="1" w:uiPriority="9" w:unhideWhenUsed="1" w:qFormat="1"/>
+    <w:lsdException w:name="heading 3" w:semiHidden="1" w:uiPriority="9" w:unhideWhenUsed="1" w:qFormat="1"/>
+    <w:lsdException w:name="heading 4" w:semiHidden="1" w:uiPriority="9" w:unhideWhenUsed="1" w:qFormat="1"/>
+    <w:lsdException w:name="heading 5" w:semiHidden="1" w:uiPriority="9" w:unhideWhenUsed="1" w:qFormat="1"/>
+    <w:lsdException w:name="heading 6" w:semiHidden="1" w:uiPriority="9" w:unhideWhenUsed="1" w:qFormat="1"/>
+    <w:lsdException w:name="heading 7" w:semiHidden="1" w:uiPriority="9" w:unhideWhenUsed="1" w:qFormat="1"/>
+    <w:lsdException w:name="heading 8" w:semiHidden="1" w:uiPriority="9" w:unhideWhenUsed="1" w:qFormat="1"/>
+    <w:lsdException w:name="heading 9" w:semiHidden="1" w:uiPriority="9" w:unhideWhenUsed="1" w:qFormat="1"/>
     <w:lsdException w:name="index 1" w:semiHidden="1" w:unhideWhenUsed="1"/>
     <w:lsdException w:name="index 2" w:semiHidden="1" w:unhideWhenUsed="1"/>
     <w:lsdException w:name="index 3" w:semiHidden="1" w:unhideWhenUsed="1"/>
@@ -658,22 +617,22 @@
     <w:lsdException w:name="index 7" w:semiHidden="1" w:unhideWhenUsed="1"/>
     <w:lsdException w:name="index 8" w:semiHidden="1" w:unhideWhenUsed="1"/>
     <w:lsdException w:name="index 9" w:semiHidden="1" w:unhideWhenUsed="1"/>
-    <w:lsdException w:name="toc 1" w:uiPriority="39" w:semiHidden="1" w:unhideWhenUsed="1"/>
-    <w:lsdException w:name="toc 2" w:uiPriority="39" w:semiHidden="1" w:unhideWhenUsed="1"/>
-    <w:lsdException w:name="toc 3" w:uiPriority="39" w:semiHidden="1" w:unhideWhenUsed="1"/>
-    <w:lsdException w:name="toc 4" w:uiPriority="39" w:semiHidden="1" w:unhideWhenUsed="1"/>
-    <w:lsdException w:name="toc 5" w:uiPriority="39" w:semiHidden="1" w:unhideWhenUsed="1"/>
-    <w:lsdException w:name="toc 6" w:uiPriority="39" w:semiHidden="1" w:unhideWhenUsed="1"/>
-    <w:lsdException w:name="toc 7" w:uiPriority="39" w:semiHidden="1" w:unhideWhenUsed="1"/>
-    <w:lsdException w:name="toc 8" w:uiPriority="39" w:semiHidden="1" w:unhideWhenUsed="1"/>
-    <w:lsdException w:name="toc 9" w:uiPriority="39" w:semiHidden="1" w:unhideWhenUsed="1"/>
+    <w:lsdException w:name="toc 1" w:semiHidden="1" w:uiPriority="39" w:unhideWhenUsed="1"/>
+    <w:lsdException w:name="toc 2" w:semiHidden="1" w:uiPriority="39" w:unhideWhenUsed="1"/>
+    <w:lsdException w:name="toc 3" w:semiHidden="1" w:uiPriority="39" w:unhideWhenUsed="1"/>
+    <w:lsdException w:name="toc 4" w:semiHidden="1" w:uiPriority="39" w:unhideWhenUsed="1"/>
+    <w:lsdException w:name="toc 5" w:semiHidden="1" w:uiPriority="39" w:unhideWhenUsed="1"/>
+    <w:lsdException w:name="toc 6" w:semiHidden="1" w:uiPriority="39" w:unhideWhenUsed="1"/>
+    <w:lsdException w:name="toc 7" w:semiHidden="1" w:uiPriority="39" w:unhideWhenUsed="1"/>
+    <w:lsdException w:name="toc 8" w:semiHidden="1" w:uiPriority="39" w:unhideWhenUsed="1"/>
+    <w:lsdException w:name="toc 9" w:semiHidden="1" w:uiPriority="39" w:unhideWhenUsed="1"/>
     <w:lsdException w:name="Normal Indent" w:semiHidden="1" w:unhideWhenUsed="1"/>
     <w:lsdException w:name="footnote text" w:semiHidden="1" w:unhideWhenUsed="1"/>
     <w:lsdException w:name="annotation text" w:semiHidden="1" w:unhideWhenUsed="1"/>
     <w:lsdException w:name="header" w:semiHidden="1" w:unhideWhenUsed="1"/>
     <w:lsdException w:name="footer" w:semiHidden="1" w:unhideWhenUsed="1"/>
     <w:lsdException w:name="index heading" w:semiHidden="1" w:unhideWhenUsed="1"/>
-    <w:lsdException w:name="caption" w:uiPriority="35" w:semiHidden="1" w:unhideWhenUsed="1" w:qFormat="1"/>
+    <w:lsdException w:name="caption" w:semiHidden="1" w:uiPriority="35" w:unhideWhenUsed="1" w:qFormat="1"/>
     <w:lsdException w:name="table of figures" w:semiHidden="1" w:unhideWhenUsed="1"/>
     <w:lsdException w:name="envelope address" w:semiHidden="1" w:unhideWhenUsed="1"/>
     <w:lsdException w:name="envelope return" w:semiHidden="1" w:unhideWhenUsed="1"/>
@@ -704,7 +663,7 @@
     <w:lsdException w:name="Title" w:uiPriority="10" w:qFormat="1"/>
     <w:lsdException w:name="Closing" w:semiHidden="1" w:unhideWhenUsed="1"/>
     <w:lsdException w:name="Signature" w:semiHidden="1" w:unhideWhenUsed="1"/>
-    <w:lsdException w:name="Default Paragraph Font" w:uiPriority="1" w:semiHidden="1" w:unhideWhenUsed="1"/>
+    <w:lsdException w:name="Default Paragraph Font" w:semiHidden="1" w:uiPriority="1" w:unhideWhenUsed="1"/>
     <w:lsdException w:name="Body Text" w:semiHidden="1" w:unhideWhenUsed="1"/>
     <w:lsdException w:name="Body Text Indent" w:semiHidden="1" w:unhideWhenUsed="1"/>
     <w:lsdException w:name="List Continue" w:semiHidden="1" w:unhideWhenUsed="1"/>
@@ -904,8 +863,8 @@
     <w:lsdException w:name="Subtle Reference" w:uiPriority="31" w:qFormat="1"/>
     <w:lsdException w:name="Intense Reference" w:uiPriority="32" w:qFormat="1"/>
     <w:lsdException w:name="Book Title" w:uiPriority="33" w:qFormat="1"/>
-    <w:lsdException w:name="Bibliography" w:uiPriority="37" w:semiHidden="1" w:unhideWhenUsed="1"/>
-    <w:lsdException w:name="TOC Heading" w:uiPriority="39" w:semiHidden="1" w:unhideWhenUsed="1" w:qFormat="1"/>
+    <w:lsdException w:name="Bibliography" w:semiHidden="1" w:uiPriority="37" w:unhideWhenUsed="1"/>
+    <w:lsdException w:name="TOC Heading" w:semiHidden="1" w:uiPriority="39" w:unhideWhenUsed="1" w:qFormat="1"/>
     <w:lsdException w:name="Plain Table 1" w:uiPriority="41"/>
     <w:lsdException w:name="Plain Table 2" w:uiPriority="42"/>
     <w:lsdException w:name="Plain Table 3" w:uiPriority="43"/>
@@ -1010,49 +969,15 @@
     <w:lsdException w:name="List Table 5 Dark Accent 6" w:uiPriority="50"/>
     <w:lsdException w:name="List Table 6 Colorful Accent 6" w:uiPriority="51"/>
     <w:lsdException w:name="List Table 7 Colorful Accent 6" w:uiPriority="52"/>
+    <w:lsdException w:name="Mention" w:semiHidden="1" w:unhideWhenUsed="1"/>
+    <w:lsdException w:name="Smart Hyperlink" w:semiHidden="1" w:unhideWhenUsed="1"/>
+    <w:lsdException w:name="Hashtag" w:semiHidden="1" w:unhideWhenUsed="1"/>
+    <w:lsdException w:name="Unresolved Mention" w:semiHidden="1" w:unhideWhenUsed="1"/>
+    <w:lsdException w:name="Smart Link" w:semiHidden="1" w:unhideWhenUsed="1"/>
   </w:latentStyles>
-  <w:style w:type="paragraph" w:styleId="Normal" w:default="1">
+  <w:style w:type="paragraph" w:default="1" w:styleId="Normal">
     <w:name w:val="Normal"/>
     <w:qFormat/>
-  </w:style>
-  <w:style w:type="character" w:styleId="DefaultParagraphFont" w:default="1">
-    <w:name w:val="Default Paragraph Font"/>
-    <w:uiPriority w:val="1"/>
-    <w:semiHidden/>
-    <w:unhideWhenUsed/>
-  </w:style>
-  <w:style w:type="table" w:styleId="TableNormal" w:default="1">
-    <w:name w:val="Normal Table"/>
-    <w:uiPriority w:val="99"/>
-    <w:semiHidden/>
-    <w:unhideWhenUsed/>
-    <w:tblPr>
-      <w:tblInd w:w="0" w:type="dxa"/>
-      <w:tblCellMar>
-        <w:top w:w="0" w:type="dxa"/>
-        <w:left w:w="108" w:type="dxa"/>
-        <w:bottom w:w="0" w:type="dxa"/>
-        <w:right w:w="108" w:type="dxa"/>
-      </w:tblCellMar>
-    </w:tblPr>
-  </w:style>
-  <w:style w:type="numbering" w:styleId="NoList" w:default="1">
-    <w:name w:val="No List"/>
-    <w:uiPriority w:val="99"/>
-    <w:semiHidden/>
-    <w:unhideWhenUsed/>
-  </w:style>
-  <w:style w:type="character" w:styleId="Heading1Char" w:customStyle="1">
-    <w:name w:val="Heading 1 Char"/>
-    <w:basedOn w:val="DefaultParagraphFont"/>
-    <w:link w:val="Heading1"/>
-    <w:uiPriority w:val="9"/>
-    <w:rPr>
-      <w:rFonts w:asciiTheme="majorHAnsi" w:hAnsiTheme="majorHAnsi" w:eastAsiaTheme="majorEastAsia" w:cstheme="majorBidi"/>
-      <w:color w:val="0F4761" w:themeColor="accent1" w:themeShade="BF"/>
-      <w:sz w:val="40"/>
-      <w:szCs w:val="40"/>
-    </w:rPr>
   </w:style>
   <w:style w:type="paragraph" w:styleId="Heading1">
     <w:name w:val="heading 1"/>
@@ -1068,22 +993,10 @@
       <w:outlineLvl w:val="0"/>
     </w:pPr>
     <w:rPr>
-      <w:rFonts w:asciiTheme="majorHAnsi" w:hAnsiTheme="majorHAnsi" w:eastAsiaTheme="majorEastAsia" w:cstheme="majorBidi"/>
+      <w:rFonts w:asciiTheme="majorHAnsi" w:eastAsiaTheme="majorEastAsia" w:hAnsiTheme="majorHAnsi" w:cstheme="majorBidi"/>
       <w:color w:val="0F4761" w:themeColor="accent1" w:themeShade="BF"/>
       <w:sz w:val="40"/>
       <w:szCs w:val="40"/>
-    </w:rPr>
-  </w:style>
-  <w:style w:type="character" w:styleId="Heading2Char" w:customStyle="1">
-    <w:name w:val="Heading 2 Char"/>
-    <w:basedOn w:val="DefaultParagraphFont"/>
-    <w:link w:val="Heading2"/>
-    <w:uiPriority w:val="9"/>
-    <w:rPr>
-      <w:rFonts w:asciiTheme="majorHAnsi" w:hAnsiTheme="majorHAnsi" w:eastAsiaTheme="majorEastAsia" w:cstheme="majorBidi"/>
-      <w:color w:val="0F4761" w:themeColor="accent1" w:themeShade="BF"/>
-      <w:sz w:val="32"/>
-      <w:szCs w:val="32"/>
     </w:rPr>
   </w:style>
   <w:style w:type="paragraph" w:styleId="Heading2">
@@ -1101,22 +1014,10 @@
       <w:outlineLvl w:val="1"/>
     </w:pPr>
     <w:rPr>
-      <w:rFonts w:asciiTheme="majorHAnsi" w:hAnsiTheme="majorHAnsi" w:eastAsiaTheme="majorEastAsia" w:cstheme="majorBidi"/>
+      <w:rFonts w:asciiTheme="majorHAnsi" w:eastAsiaTheme="majorEastAsia" w:hAnsiTheme="majorHAnsi" w:cstheme="majorBidi"/>
       <w:color w:val="0F4761" w:themeColor="accent1" w:themeShade="BF"/>
       <w:sz w:val="32"/>
       <w:szCs w:val="32"/>
-    </w:rPr>
-  </w:style>
-  <w:style w:type="character" w:styleId="Heading3Char" w:customStyle="1">
-    <w:name w:val="Heading 3 Char"/>
-    <w:basedOn w:val="DefaultParagraphFont"/>
-    <w:link w:val="Heading3"/>
-    <w:uiPriority w:val="9"/>
-    <w:rPr>
-      <w:rFonts w:eastAsiaTheme="majorEastAsia" w:cstheme="majorBidi"/>
-      <w:color w:val="0F4761" w:themeColor="accent1" w:themeShade="BF"/>
-      <w:sz w:val="28"/>
-      <w:szCs w:val="28"/>
     </w:rPr>
   </w:style>
   <w:style w:type="paragraph" w:styleId="Heading3">
@@ -1140,18 +1041,6 @@
       <w:szCs w:val="28"/>
     </w:rPr>
   </w:style>
-  <w:style w:type="character" w:styleId="Heading4Char" w:customStyle="1">
-    <w:name w:val="Heading 4 Char"/>
-    <w:basedOn w:val="DefaultParagraphFont"/>
-    <w:link w:val="Heading4"/>
-    <w:uiPriority w:val="9"/>
-    <w:rPr>
-      <w:rFonts w:eastAsiaTheme="majorEastAsia" w:cstheme="majorBidi"/>
-      <w:i/>
-      <w:iCs/>
-      <w:color w:val="0F4761" w:themeColor="accent1" w:themeShade="BF"/>
-    </w:rPr>
-  </w:style>
   <w:style w:type="paragraph" w:styleId="Heading4">
     <w:name w:val="heading 4"/>
     <w:basedOn w:val="Normal"/>
@@ -1173,16 +1062,6 @@
       <w:color w:val="0F4761" w:themeColor="accent1" w:themeShade="BF"/>
     </w:rPr>
   </w:style>
-  <w:style w:type="character" w:styleId="Heading5Char" w:customStyle="1">
-    <w:name w:val="Heading 5 Char"/>
-    <w:basedOn w:val="DefaultParagraphFont"/>
-    <w:link w:val="Heading5"/>
-    <w:uiPriority w:val="9"/>
-    <w:rPr>
-      <w:rFonts w:eastAsiaTheme="majorEastAsia" w:cstheme="majorBidi"/>
-      <w:color w:val="0F4761" w:themeColor="accent1" w:themeShade="BF"/>
-    </w:rPr>
-  </w:style>
   <w:style w:type="paragraph" w:styleId="Heading5">
     <w:name w:val="heading 5"/>
     <w:basedOn w:val="Normal"/>
@@ -1202,18 +1081,6 @@
       <w:color w:val="0F4761" w:themeColor="accent1" w:themeShade="BF"/>
     </w:rPr>
   </w:style>
-  <w:style w:type="character" w:styleId="Heading6Char" w:customStyle="1">
-    <w:name w:val="Heading 6 Char"/>
-    <w:basedOn w:val="DefaultParagraphFont"/>
-    <w:link w:val="Heading6"/>
-    <w:uiPriority w:val="9"/>
-    <w:rPr>
-      <w:rFonts w:eastAsiaTheme="majorEastAsia" w:cstheme="majorBidi"/>
-      <w:i/>
-      <w:iCs/>
-      <w:color w:val="595959" w:themeColor="text1" w:themeTint="A6"/>
-    </w:rPr>
-  </w:style>
   <w:style w:type="paragraph" w:styleId="Heading6">
     <w:name w:val="heading 6"/>
     <w:basedOn w:val="Normal"/>
@@ -1235,16 +1102,6 @@
       <w:color w:val="595959" w:themeColor="text1" w:themeTint="A6"/>
     </w:rPr>
   </w:style>
-  <w:style w:type="character" w:styleId="Heading7Char" w:customStyle="1">
-    <w:name w:val="Heading 7 Char"/>
-    <w:basedOn w:val="DefaultParagraphFont"/>
-    <w:link w:val="Heading7"/>
-    <w:uiPriority w:val="9"/>
-    <w:rPr>
-      <w:rFonts w:eastAsiaTheme="majorEastAsia" w:cstheme="majorBidi"/>
-      <w:color w:val="595959" w:themeColor="text1" w:themeTint="A6"/>
-    </w:rPr>
-  </w:style>
   <w:style w:type="paragraph" w:styleId="Heading7">
     <w:name w:val="heading 7"/>
     <w:basedOn w:val="Normal"/>
@@ -1264,18 +1121,6 @@
       <w:color w:val="595959" w:themeColor="text1" w:themeTint="A6"/>
     </w:rPr>
   </w:style>
-  <w:style w:type="character" w:styleId="Heading8Char" w:customStyle="1">
-    <w:name w:val="Heading 8 Char"/>
-    <w:basedOn w:val="DefaultParagraphFont"/>
-    <w:link w:val="Heading8"/>
-    <w:uiPriority w:val="9"/>
-    <w:rPr>
-      <w:rFonts w:eastAsiaTheme="majorEastAsia" w:cstheme="majorBidi"/>
-      <w:i/>
-      <w:iCs/>
-      <w:color w:val="272727" w:themeColor="text1" w:themeTint="D8"/>
-    </w:rPr>
-  </w:style>
   <w:style w:type="paragraph" w:styleId="Heading8">
     <w:name w:val="heading 8"/>
     <w:basedOn w:val="Normal"/>
@@ -1297,16 +1142,6 @@
       <w:color w:val="272727" w:themeColor="text1" w:themeTint="D8"/>
     </w:rPr>
   </w:style>
-  <w:style w:type="character" w:styleId="Heading9Char" w:customStyle="1">
-    <w:name w:val="Heading 9 Char"/>
-    <w:basedOn w:val="DefaultParagraphFont"/>
-    <w:link w:val="Heading9"/>
-    <w:uiPriority w:val="9"/>
-    <w:rPr>
-      <w:rFonts w:eastAsiaTheme="majorEastAsia" w:cstheme="majorBidi"/>
-      <w:color w:val="272727" w:themeColor="text1" w:themeTint="D8"/>
-    </w:rPr>
-  </w:style>
   <w:style w:type="paragraph" w:styleId="Heading9">
     <w:name w:val="heading 9"/>
     <w:basedOn w:val="Normal"/>
@@ -1326,13 +1161,142 @@
       <w:color w:val="272727" w:themeColor="text1" w:themeTint="D8"/>
     </w:rPr>
   </w:style>
-  <w:style w:type="character" w:styleId="TitleChar" w:customStyle="1">
+  <w:style w:type="character" w:default="1" w:styleId="DefaultParagraphFont">
+    <w:name w:val="Default Paragraph Font"/>
+    <w:uiPriority w:val="1"/>
+    <w:semiHidden/>
+    <w:unhideWhenUsed/>
+  </w:style>
+  <w:style w:type="table" w:default="1" w:styleId="TableNormal">
+    <w:name w:val="Normal Table"/>
+    <w:uiPriority w:val="99"/>
+    <w:semiHidden/>
+    <w:unhideWhenUsed/>
+    <w:tblPr>
+      <w:tblInd w:w="0" w:type="dxa"/>
+      <w:tblCellMar>
+        <w:top w:w="0" w:type="dxa"/>
+        <w:left w:w="108" w:type="dxa"/>
+        <w:bottom w:w="0" w:type="dxa"/>
+        <w:right w:w="108" w:type="dxa"/>
+      </w:tblCellMar>
+    </w:tblPr>
+  </w:style>
+  <w:style w:type="numbering" w:default="1" w:styleId="NoList">
+    <w:name w:val="No List"/>
+    <w:uiPriority w:val="99"/>
+    <w:semiHidden/>
+    <w:unhideWhenUsed/>
+  </w:style>
+  <w:style w:type="character" w:customStyle="1" w:styleId="Heading1Char">
+    <w:name w:val="Heading 1 Char"/>
+    <w:basedOn w:val="DefaultParagraphFont"/>
+    <w:link w:val="Heading1"/>
+    <w:uiPriority w:val="9"/>
+    <w:rPr>
+      <w:rFonts w:asciiTheme="majorHAnsi" w:eastAsiaTheme="majorEastAsia" w:hAnsiTheme="majorHAnsi" w:cstheme="majorBidi"/>
+      <w:color w:val="0F4761" w:themeColor="accent1" w:themeShade="BF"/>
+      <w:sz w:val="40"/>
+      <w:szCs w:val="40"/>
+    </w:rPr>
+  </w:style>
+  <w:style w:type="character" w:customStyle="1" w:styleId="Heading2Char">
+    <w:name w:val="Heading 2 Char"/>
+    <w:basedOn w:val="DefaultParagraphFont"/>
+    <w:link w:val="Heading2"/>
+    <w:uiPriority w:val="9"/>
+    <w:rPr>
+      <w:rFonts w:asciiTheme="majorHAnsi" w:eastAsiaTheme="majorEastAsia" w:hAnsiTheme="majorHAnsi" w:cstheme="majorBidi"/>
+      <w:color w:val="0F4761" w:themeColor="accent1" w:themeShade="BF"/>
+      <w:sz w:val="32"/>
+      <w:szCs w:val="32"/>
+    </w:rPr>
+  </w:style>
+  <w:style w:type="character" w:customStyle="1" w:styleId="Heading3Char">
+    <w:name w:val="Heading 3 Char"/>
+    <w:basedOn w:val="DefaultParagraphFont"/>
+    <w:link w:val="Heading3"/>
+    <w:uiPriority w:val="9"/>
+    <w:rPr>
+      <w:rFonts w:eastAsiaTheme="majorEastAsia" w:cstheme="majorBidi"/>
+      <w:color w:val="0F4761" w:themeColor="accent1" w:themeShade="BF"/>
+      <w:sz w:val="28"/>
+      <w:szCs w:val="28"/>
+    </w:rPr>
+  </w:style>
+  <w:style w:type="character" w:customStyle="1" w:styleId="Heading4Char">
+    <w:name w:val="Heading 4 Char"/>
+    <w:basedOn w:val="DefaultParagraphFont"/>
+    <w:link w:val="Heading4"/>
+    <w:uiPriority w:val="9"/>
+    <w:rPr>
+      <w:rFonts w:eastAsiaTheme="majorEastAsia" w:cstheme="majorBidi"/>
+      <w:i/>
+      <w:iCs/>
+      <w:color w:val="0F4761" w:themeColor="accent1" w:themeShade="BF"/>
+    </w:rPr>
+  </w:style>
+  <w:style w:type="character" w:customStyle="1" w:styleId="Heading5Char">
+    <w:name w:val="Heading 5 Char"/>
+    <w:basedOn w:val="DefaultParagraphFont"/>
+    <w:link w:val="Heading5"/>
+    <w:uiPriority w:val="9"/>
+    <w:rPr>
+      <w:rFonts w:eastAsiaTheme="majorEastAsia" w:cstheme="majorBidi"/>
+      <w:color w:val="0F4761" w:themeColor="accent1" w:themeShade="BF"/>
+    </w:rPr>
+  </w:style>
+  <w:style w:type="character" w:customStyle="1" w:styleId="Heading6Char">
+    <w:name w:val="Heading 6 Char"/>
+    <w:basedOn w:val="DefaultParagraphFont"/>
+    <w:link w:val="Heading6"/>
+    <w:uiPriority w:val="9"/>
+    <w:rPr>
+      <w:rFonts w:eastAsiaTheme="majorEastAsia" w:cstheme="majorBidi"/>
+      <w:i/>
+      <w:iCs/>
+      <w:color w:val="595959" w:themeColor="text1" w:themeTint="A6"/>
+    </w:rPr>
+  </w:style>
+  <w:style w:type="character" w:customStyle="1" w:styleId="Heading7Char">
+    <w:name w:val="Heading 7 Char"/>
+    <w:basedOn w:val="DefaultParagraphFont"/>
+    <w:link w:val="Heading7"/>
+    <w:uiPriority w:val="9"/>
+    <w:rPr>
+      <w:rFonts w:eastAsiaTheme="majorEastAsia" w:cstheme="majorBidi"/>
+      <w:color w:val="595959" w:themeColor="text1" w:themeTint="A6"/>
+    </w:rPr>
+  </w:style>
+  <w:style w:type="character" w:customStyle="1" w:styleId="Heading8Char">
+    <w:name w:val="Heading 8 Char"/>
+    <w:basedOn w:val="DefaultParagraphFont"/>
+    <w:link w:val="Heading8"/>
+    <w:uiPriority w:val="9"/>
+    <w:rPr>
+      <w:rFonts w:eastAsiaTheme="majorEastAsia" w:cstheme="majorBidi"/>
+      <w:i/>
+      <w:iCs/>
+      <w:color w:val="272727" w:themeColor="text1" w:themeTint="D8"/>
+    </w:rPr>
+  </w:style>
+  <w:style w:type="character" w:customStyle="1" w:styleId="Heading9Char">
+    <w:name w:val="Heading 9 Char"/>
+    <w:basedOn w:val="DefaultParagraphFont"/>
+    <w:link w:val="Heading9"/>
+    <w:uiPriority w:val="9"/>
+    <w:rPr>
+      <w:rFonts w:eastAsiaTheme="majorEastAsia" w:cstheme="majorBidi"/>
+      <w:color w:val="272727" w:themeColor="text1" w:themeTint="D8"/>
+    </w:rPr>
+  </w:style>
+  <w:style w:type="character" w:customStyle="1" w:styleId="TitleChar">
     <w:name w:val="Title Char"/>
     <w:basedOn w:val="DefaultParagraphFont"/>
     <w:link w:val="Title"/>
     <w:uiPriority w:val="10"/>
     <w:rPr>
-      <w:rFonts w:asciiTheme="majorHAnsi" w:hAnsiTheme="majorHAnsi" w:eastAsiaTheme="majorEastAsia" w:cstheme="majorBidi"/>
+      <w:rFonts w:asciiTheme="majorHAnsi" w:eastAsiaTheme="majorEastAsia" w:hAnsiTheme="majorHAnsi" w:cstheme="majorBidi"/>
       <w:spacing w:val="-10"/>
       <w:kern w:val="28"/>
       <w:sz w:val="56"/>
@@ -1351,14 +1315,14 @@
       <w:contextualSpacing/>
     </w:pPr>
     <w:rPr>
-      <w:rFonts w:asciiTheme="majorHAnsi" w:hAnsiTheme="majorHAnsi" w:eastAsiaTheme="majorEastAsia" w:cstheme="majorBidi"/>
+      <w:rFonts w:asciiTheme="majorHAnsi" w:eastAsiaTheme="majorEastAsia" w:hAnsiTheme="majorHAnsi" w:cstheme="majorBidi"/>
       <w:spacing w:val="-10"/>
       <w:kern w:val="28"/>
       <w:sz w:val="56"/>
       <w:szCs w:val="56"/>
     </w:rPr>
   </w:style>
-  <w:style w:type="character" w:styleId="SubtitleChar" w:customStyle="1">
+  <w:style w:type="character" w:customStyle="1" w:styleId="SubtitleChar">
     <w:name w:val="Subtitle Char"/>
     <w:basedOn w:val="DefaultParagraphFont"/>
     <w:link w:val="Subtitle"/>
@@ -1402,7 +1366,7 @@
       <w:color w:val="0F4761" w:themeColor="accent1" w:themeShade="BF"/>
     </w:rPr>
   </w:style>
-  <w:style w:type="character" w:styleId="QuoteChar" w:customStyle="1">
+  <w:style w:type="character" w:customStyle="1" w:styleId="QuoteChar">
     <w:name w:val="Quote Char"/>
     <w:basedOn w:val="DefaultParagraphFont"/>
     <w:link w:val="Quote"/>
@@ -1430,7 +1394,7 @@
       <w:color w:val="404040" w:themeColor="text1" w:themeTint="BF"/>
     </w:rPr>
   </w:style>
-  <w:style w:type="character" w:styleId="IntenseQuoteChar" w:customStyle="1">
+  <w:style w:type="character" w:customStyle="1" w:styleId="IntenseQuoteChar">
     <w:name w:val="Intense Quote Char"/>
     <w:basedOn w:val="DefaultParagraphFont"/>
     <w:link w:val="IntenseQuote"/>
@@ -1450,8 +1414,8 @@
     <w:qFormat/>
     <w:pPr>
       <w:pBdr>
-        <w:top w:val="single" w:color="0F4761" w:themeColor="accent1" w:themeShade="BF" w:sz="4" w:space="10"/>
-        <w:bottom w:val="single" w:color="0F4761" w:themeColor="accent1" w:themeShade="BF" w:sz="4" w:space="10"/>
+        <w:top w:val="single" w:sz="4" w:space="10" w:color="0F4761" w:themeColor="accent1" w:themeShade="BF"/>
+        <w:bottom w:val="single" w:sz="4" w:space="10" w:color="0F4761" w:themeColor="accent1" w:themeShade="BF"/>
       </w:pBdr>
       <w:spacing w:before="360" w:after="360"/>
       <w:ind w:left="864" w:right="864"/>
@@ -1477,13 +1441,12 @@
     </w:rPr>
   </w:style>
   <w:style w:type="paragraph" w:styleId="ListParagraph">
-    <w:uiPriority w:val="34"/>
     <w:name w:val="List Paragraph"/>
     <w:basedOn w:val="Normal"/>
+    <w:uiPriority w:val="34"/>
     <w:qFormat/>
     <w:rsid w:val="565F364A"/>
     <w:pPr>
-      <w:spacing/>
       <w:ind w:left="720"/>
       <w:contextualSpacing/>
     </w:pPr>
@@ -1492,7 +1455,7 @@
 </file>
 
 <file path=word/theme/theme1.xml><?xml version="1.0" encoding="utf-8"?>
-<a:theme xmlns:thm15="http://schemas.microsoft.com/office/thememl/2012/main" xmlns:a="http://schemas.openxmlformats.org/drawingml/2006/main" name="Office Theme">
+<a:theme xmlns:a="http://schemas.openxmlformats.org/drawingml/2006/main" name="Office Theme">
   <a:themeElements>
     <a:clrScheme name="Office">
       <a:dk1>

</xml_diff>